<commit_message>
Scenario B: Methods and Results drafts with full figure citations, Figures 1-5 (English, renumbered by citation order), RRHO2 quadrant boundary correction (H2 unchanged)
</commit_message>
<xml_diff>
--- a/manuscript/drafts/results_scenarioB_tr.docx
+++ b/manuscript/drafts/results_scenarioB_tr.docx
@@ -33,7 +33,7 @@
         <w:pStyle w:val="FirstParagraph"/>
       </w:pPr>
       <w:r>
-        <w:t xml:space="preserve">Hipokampus ile sınırlandırılmış AH meta-kohortunda (n = 51; AH 18, kontrol 33) ve TCGA-GBM/GTEx kohortunda (n = 338; tümör 152, kontrol 186) Model A (kompozisyon düzeltmesiz), AH için 4.449, GBM için 14.811 DEG (FDR &lt; 0,05) üretmiştir. Bu iki liste arasında aynı yönde değişen 1.458 paylaşılan DEG bulunmuştur (Tablo 3; [Şekil 2]).</w:t>
+        <w:t xml:space="preserve">Hipokampus ile sınırlandırılmış AH meta-kohortunda (n = 51; AH 18, kontrol 33) ve TCGA-GBM/GTEx kohortunda (n = 338; tümör 152, kontrol 186) Model A (kompozisyon düzeltmesiz), AH için 4.449, GBM için 14.811 DEG (FDR &lt; 0,05) üretmiştir (Şekil 2A). Bu iki liste arasında aynı yönde değişen 1.458 paylaşılan DEG bulunmuştur (Tablo 3).</w:t>
       </w:r>
     </w:p>
     <w:p>
@@ -41,7 +41,7 @@
         <w:pStyle w:val="BodyText"/>
       </w:pPr>
       <w:r>
-        <w:t xml:space="preserve">Kompozisyon kovaryatları eklendiğinde paylaşılan DEG sayısı her iki dekonvolüsyon yönteminde de sıfıra inmiştir (Model B, BRETIGEA: 0; Model C, MuSiC: 0). Model B/Model A ve Model C/Model A oranları 0,000’dır. Her iki oran da önceden belirlenmiş ≤ 0,20 eşiğinin altında kaldığından,</w:t>
+        <w:t xml:space="preserve">Kompozisyon kovaryatları eklendiğinde paylaşılan DEG sayısı her iki dekonvolüsyon yönteminde de sıfıra inmiştir (Model B, BRETIGEA: 0; Model C, MuSiC: 0; Şekil 2C). Model B/Model A ve Model C/Model A oranları 0,000’dır. Her iki oran da önceden belirlenmiş ≤ 0,20 eşiğinin altında kaldığından,</w:t>
       </w:r>
       <w:r>
         <w:t xml:space="preserve"> </w:t>
@@ -57,7 +57,7 @@
         <w:t xml:space="preserve"> </w:t>
       </w:r>
       <w:r>
-        <w:t xml:space="preserve">Bu sonuç önceden tanımlanmış tüm duyarlılık analizlerinde değişmemiştir: kat değişimi eşiği eklendiğinde (Model A: 413 paylaşılan DEG), kontrol grubu yalnızca BA9 ile (1.587) ya da yalnızca hipokampus ile (1.240) sınırlandırıldığında ve kat değişimi eşiği tek bölge kısıtlamasıyla birlikte uygulandığında (BA9: 485; hipokampus: 340), Model B ve Model C altında paylaşılan DEG sayısı her durumda 0 olarak bulunmuştur. Her iki yöntemin kovaryatlarını birlikte içeren keşifsel Model D’de de paylaşılan DEG gözlenmemiştir.</w:t>
+        <w:t xml:space="preserve">Bu sonuç önceden tanımlanmış tüm duyarlılık analizlerinde değişmemiştir: kat değişimi eşiği eklendiğinde (Model A: 413 paylaşılan DEG), kontrol grubu yalnızca BA9 ile (1.587) ya da yalnızca hipokampus ile (1.240) sınırlandırıldığında ve kat değişimi eşiği tek bölge kısıtlamasıyla birlikte uygulandığında (BA9: 485; hipokampus: 340), Model B ve Model C altında paylaşılan DEG sayısı her durumda 0 olarak bulunmuştur (Şekil 2C). Her iki yöntemin kovaryatlarını birlikte içeren keşifsel Model D’de de paylaşılan DEG gözlenmemiştir.</w:t>
       </w:r>
     </w:p>
     <w:p>
@@ -557,7 +557,7 @@
         <w:pStyle w:val="BodyText"/>
       </w:pPr>
       <w:r>
-        <w:t xml:space="preserve">İki yöntemin GBM kohortundaki davranışı ve MuSiC tahminleri, yöntemlere özgü sınırlılıklara işaret etmektedir. MuSiC ile tahmin edilen oranlar her iki kohortta biyolojik olarak inandırıcı değildir: AH kontrol hipokampusunda nöron oranı %0,9, endotel %43 ve mikroglia %31; GTEx kontrol korteksinde nöron %0,7, endotel %46 ve mikroglia %16; GBM tümörlerinde ise nöron %0,0 ve endotel %60 olarak tahmin edilmiştir. BRETIGEA astrosit skorunu oluşturan marker genler GBM kohortunda tutarsız davranmıştır (ör. AQP4 ile skor arasındaki korelasyon −0,22, GFAP ile −0,27, ETNPPL ile +0,87). Bu tutarsızlık, malign AC-benzeri hücrelerin astrosit markerlarını ifade etmesiyle uyumludur. Bu nedenle GBM tarafındaki kompozisyon düzeltmesi, normal glial hücre oranlarını ancak kısmen yansıtıyor olabilir.</w:t>
+        <w:t xml:space="preserve">İki yöntemin GBM kohortundaki davranışı ve MuSiC tahminleri, yöntemlere özgü sınırlılıklara işaret etmektedir. MuSiC ile tahmin edilen oranlar her iki kohortta biyolojik olarak inandırıcı değildir (Şekil 2B): AH kontrol hipokampusunda nöron oranı %0,9, endotel %43 ve mikroglia %31; GTEx kontrol korteksinde nöron %0,7, endotel %46 ve mikroglia %16; GBM tümörlerinde ise nöron %0,0 ve endotel %60 olarak tahmin edilmiştir. BRETIGEA astrosit skorunu oluşturan marker genler GBM kohortunda tutarsız davranmıştır (ör. AQP4 ile skor arasındaki korelasyon −0,22, GFAP ile −0,27, ETNPPL ile +0,87). Bu tutarsızlık, malign AC-benzeri hücrelerin astrosit markerlarını ifade etmesiyle uyumludur. Bu nedenle GBM tarafındaki kompozisyon düzeltmesi, normal glial hücre oranlarını ancak kısmen yansıtıyor olabilir.</w:t>
       </w:r>
     </w:p>
     <w:bookmarkEnd w:id="20"/>
@@ -583,7 +583,7 @@
         <w:pStyle w:val="BodyText"/>
       </w:pPr>
       <w:r>
-        <w:t xml:space="preserve">İmza boş olduğundan Aşama 3 testleri planda tanımlandığı biçimde tam sıralı gen listeleri (RRHO2) ve sıralamanın ilk 200 geni (hipergeometrik ve permütasyon testleri) üzerinden yürütülmüştür. Uygulamanın doğruluğu, orijinal Aşama 1 girdisiyle orijinal sonucun birebir yeniden üretilmesiyle doğrulanmıştır (RRHO2 haritasındaki en yüksek değer: 6,54; satır 35, sütun 38). Sonuçlar Tablo 4’te özetlenmiştir.</w:t>
+        <w:t xml:space="preserve">İmza boş olduğundan Aşama 3 testleri planda tanımlandığı biçimde tam sıralı gen listeleri (RRHO2) ve sıralamanın ilk 200 geni (hipergeometrik ve permütasyon testleri) üzerinden yürütülmüştür. Uygulamanın doğruluğu, orijinal Aşama 1 girdisiyle orijinal sonucun birebir yeniden üretilmesiyle doğrulanmıştır (RRHO2 haritasındaki en yüksek değer: 6,54; satır 35, sütun 38). Sonuçlar Tablo 4’te özetlenmiş, RRHO2 haritaları Şekil 3’te gösterilmiştir.</w:t>
       </w:r>
     </w:p>
     <w:p>
@@ -1074,7 +1074,7 @@
         <w:t xml:space="preserve"> </w:t>
       </w:r>
       <w:r>
-        <w:t xml:space="preserve">Belgelenmiş Braak II sapmasında ve orijinal uygulamada da sonuç aynıdır. Orijinal uygulamada RRHO2 haritasındaki güçlü sinyal (düzeltilmiş P = 5,3 × 10⁻⁴) plandaki DU konumunda değil, her iki hastalıkta aşağı yönlü (DD) çeyrekte yer almaktadır. Plan Test 1’in DU konumunda değerlendirilmesini şart koştuğundan, orijinal uygulamanın H2 değerlendirmesi de sapma kaydında daha önce belirtildiği gibi 1/3 değil, 0/3 başarılı testle sonuçlanmaktadır.</w:t>
+        <w:t xml:space="preserve">Belgelenmiş Braak II sapmasında ve orijinal uygulamada da sonuç aynıdır. Orijinal uygulamada RRHO2 haritasındaki güçlü sinyal (düzeltilmiş P = 5,3 × 10⁻⁴) plandaki DU konumunda değil, her iki hastalıkta aşağı yönlü (DD) çeyrekte yer almaktadır (Şekil 3, sol panel). Plan Test 1’in DU konumunda değerlendirilmesini şart koştuğundan, orijinal uygulamanın H2 değerlendirmesi de sapma kaydında daha önce belirtildiği gibi 1/3 değil, 0/3 başarılı testle sonuçlanmaktadır.</w:t>
       </w:r>
     </w:p>
     <w:p>
@@ -1100,7 +1100,7 @@
         <w:pStyle w:val="FirstParagraph"/>
       </w:pPr>
       <w:r>
-        <w:t xml:space="preserve">H1’deki azalmanın, eklenen kovaryatların serbestlik derecesi kaybından mı yoksa veriden türetilen herhangi bir kovaryatın etkisinden mi kaynaklandığını sınamak için iki kollu bir negatif kontrol yürütülmüştür ([Şekil 5]).</w:t>
+        <w:t xml:space="preserve">H1’deki azalmanın, eklenen kovaryatların serbestlik derecesi kaybından mı yoksa veriden türetilen herhangi bir kovaryatın etkisinden mi kaynaklandığını sınamak için iki kollu bir negatif kontrol yürütülmüştür (Şekil 4).</w:t>
       </w:r>
     </w:p>
     <w:p>
@@ -1108,7 +1108,7 @@
         <w:pStyle w:val="BodyText"/>
       </w:pPr>
       <w:r>
-        <w:t xml:space="preserve">Model A’ya altı bağımsız gürültü değişkeni eklendiğinde (Kol 1; 1.000 tekrar), AH DEG’lerinin medyanı 3.784 olarak bulunmuş ve DEG’lerin %85,1’i korunmuştur. Paylaşılan DEG’lerin medyanı ise 1.279’dur (Model A: 1.458). Önceden belirlenen kurala göre (korunma ≥ 0,80),</w:t>
+        <w:t xml:space="preserve">Model A’ya altı bağımsız gürültü değişkeni eklendiğinde (Kol 1; 1.000 tekrar), AH DEG’lerinin medyanı 3.784 olarak bulunmuş ve DEG’lerin %85,1’i korunmuştur (Şekil 4A). Paylaşılan DEG’lerin medyanı ise 1.279’dur (Model A: 1.458). Önceden belirlenen kurala göre (korunma ≥ 0,80),</w:t>
       </w:r>
       <w:r>
         <w:t xml:space="preserve"> </w:t>
@@ -1126,7 +1126,7 @@
         <w:pStyle w:val="BodyText"/>
       </w:pPr>
       <w:r>
-        <w:t xml:space="preserve">Model A’ya rastgele gen kümelerinden türetilen altı temel bileşen skoru eklendiğinde (Kol 2; 1.000 tekrar), AH DEG’lerinin medyanı 0’a inmiştir. Ancak bu rastgele bileşenler, BRETIGEA hücre tipi skorlarındaki varyansın önemli bir kısmını da açıklamıştır (medyan ortalama R² = 0,501; en düşük 0,249). Önceden belirlenen kurala göre (medyan R² ≥ 0,25), bu kol</w:t>
+        <w:t xml:space="preserve">Model A’ya rastgele gen kümelerinden türetilen altı temel bileşen skoru eklendiğinde (Kol 2; 1.000 tekrar), AH DEG’lerinin medyanı 0’a inmiştir (Şekil 4B). Ancak bu rastgele bileşenler, BRETIGEA hücre tipi skorlarındaki varyansın önemli bir kısmını da açıklamıştır (medyan ortalama R² = 0,501; en düşük 0,249; Şekil 4C). Önceden belirlenen kurala göre (medyan R² ≥ 0,25), bu kol</w:t>
       </w:r>
       <w:r>
         <w:t xml:space="preserve"> </w:t>
@@ -1165,7 +1165,7 @@
         <w:pStyle w:val="FirstParagraph"/>
       </w:pPr>
       <w:r>
-        <w:t xml:space="preserve">Orijinal Aşama 1 uygulaması, planın öngördüğü analizden üç noktada ayrılmaktaydı: aynı donöre ait üç alt-kümeyi bağımsız örnekler olarak ele almış (21 örnek, 7 donör), plandaki yaş kovaryatını içermemiş ve birincil kontrast olarak Braak II ile Braak 0’ı kullanmıştı. Bu uygulama 486 anlamlı gen üretmiş ve Aşama 3’te DD çeyreğinde görünür bir sinyal oluşturmuştu (Tablo 4, son satır). Bu sinyalin analitik seçimlere duyarlılığı keşifsel olarak incelenmiştir ([Şekil 4]).</w:t>
+        <w:t xml:space="preserve">Orijinal Aşama 1 uygulaması, planın öngördüğü analizden üç noktada ayrılmaktaydı: aynı donöre ait üç alt-kümeyi bağımsız örnekler olarak ele almış (21 örnek, 7 donör), plandaki yaş kovaryatını içermemiş ve birincil kontrast olarak Braak II ile Braak 0’ı kullanmıştı. Bu uygulama 486 anlamlı gen üretmiş ve Aşama 3’te DD çeyreğinde görünür bir sinyal oluşturmuştu (Tablo 4, son satır). Bu sinyalin analitik seçimlere duyarlılığı keşifsel olarak incelenmiştir (Şekil 5).</w:t>
       </w:r>
     </w:p>
     <w:p>
@@ -1183,7 +1183,7 @@
         <w:t xml:space="preserve"> </w:t>
       </w:r>
       <w:r>
-        <w:t xml:space="preserve">Aynı donöre ait alt-kümeler arasındaki korelasyon 0,346 olarak tahmin edilmiştir. Donör bu yapıyla hesaba katıldığında anlamlı gen sayısı 486’dan 27’ye (donör bloklu limma-voom) veya 0’a (donör düzeyinde toplanmış edgeR) düşmüştür. Buna karşın etki tahminleri büyük ölçüde korunmuştur: orijinal ve donör düzeyindeki log2FC değerleri arasındaki korelasyon 0,981, gen sıralamaları arasındaki Spearman korelasyonu 0,970’tir ve en çok aşağı yönlü 200 genin 153’ü iki sıralamada ortaktır. Yani psödo-replikasyon, etkilerin yönünü değil, bu etkilere atfedilen istatistiksel kesinliği değiştirmiştir.</w:t>
+        <w:t xml:space="preserve">Aynı donöre ait alt-kümeler arasındaki korelasyon 0,346 olarak tahmin edilmiştir. Donör bu yapıyla hesaba katıldığında anlamlı gen sayısı 486’dan 27’ye (donör bloklu limma-voom) veya 0’a (donör düzeyinde toplanmış edgeR) düşmüştür (Şekil 5A). Buna karşın etki tahminleri büyük ölçüde korunmuştur: orijinal ve donör düzeyindeki log2FC değerleri arasındaki korelasyon 0,981 (Şekil 5B), gen sıralamaları arasındaki Spearman korelasyonu 0,970’tir ve en çok aşağı yönlü 200 genin 153’ü iki sıralamada ortaktır. Yani psödo-replikasyon, etkilerin yönünü değil, bu etkilere atfedilen istatistiksel kesinliği değiştirmiştir.</w:t>
       </w:r>
     </w:p>
     <w:p>
@@ -1201,7 +1201,7 @@
         <w:t xml:space="preserve"> </w:t>
       </w:r>
       <w:r>
-        <w:t xml:space="preserve">Dört-çeyrek örtüşme testi, önceden sabitlenmiş dört eşikte (ilk 100, 200, 300 ve 500 gen) hem orijinal hem de donör düzeyindeki sıralamayla tekrarlanmıştır (Tablo 5). Orijinal sıralamada DD çeyreği dört eşiğin üçünde anlamlıyken (BH düzeltmeli P &lt; 0,05), donör düzeyindeki sıralamada yalnızca bir eşikte (ilk 300 gen) anlamlı kalmıştır. DU çeyreği ise donör düzeyindeki sıralamada dört eşiğin üçünde anlamlı bulunmuştur. Ancak bu çeyrekteki en yüksek odds oranı (ilk 200 gende 2,42), H2 için önceden belirlenen OR ≥ 3 eşiğinin altında kalmaktadır. DD ve DU çeyreklerinin eşzamanlı zenginleşmesi, AH’de aşağı yönlü genlerin GBM sıralamasının her iki ucunda da fazla temsil edildiğini göstermektedir. Bu örüntü, yönlü bir yakınsamadan çok, iki veri setinde de uç değer alma eğiliminde olan genleri yansıtıyor olabilir.</w:t>
+        <w:t xml:space="preserve">Dört-çeyrek örtüşme testi, önceden sabitlenmiş dört eşikte (ilk 100, 200, 300 ve 500 gen) hem orijinal hem de donör düzeyindeki sıralamayla tekrarlanmıştır (Tablo 5; Şekil 5C). Orijinal sıralamada DD çeyreği dört eşiğin üçünde anlamlıyken (BH düzeltmeli P &lt; 0,05), donör düzeyindeki sıralamada yalnızca bir eşikte (ilk 300 gen) anlamlı kalmıştır. DU çeyreği ise donör düzeyindeki sıralamada dört eşiğin üçünde anlamlı bulunmuştur. Ancak bu çeyrekteki en yüksek odds oranı (ilk 200 gende 2,42), H2 için önceden belirlenen OR ≥ 3 eşiğinin altında kalmaktadır. DD ve DU çeyreklerinin eşzamanlı zenginleşmesi, AH’de aşağı yönlü genlerin GBM sıralamasının her iki ucunda da fazla temsil edildiğini göstermektedir. Bu örüntü, yönlü bir yakınsamadan çok, iki veri setinde de uç değer alma eğiliminde olan genleri yansıtıyor olabilir.</w:t>
       </w:r>
     </w:p>
     <w:p>
@@ -1703,7 +1703,7 @@
         <w:t xml:space="preserve"> </w:t>
       </w:r>
       <w:r>
-        <w:t xml:space="preserve">Leng kohortunda Braak II ile Braak 0 grupları arasında yaş aralıkları örtüşmemektedir (Braak 0: 50–71, Braak II: 72–91; r = 0,80; VIF = 2,74). Braak II kontrastı korunup donör düzeyinde çıkarım ve yaş kovaryatı eklendiğinde, RRHO2 haritasındaki DD çeyreğinin en yüksek değeri 6,54’ten 1,48’e (düzeltilmiş P = 1) düşmüştür. Plana uygun Braak VI sıralaması ile orijinal sıralama arasındaki Spearman korelasyonu ise 0,584’tür. Sonuç olarak, orijinal analizdeki DD sinyali, psödo-replikasyon ile yaş kovaryatının atlanmasının birlikte yarattığı bir sinyal olarak değerlendirilmektedir.</w:t>
+        <w:t xml:space="preserve">Leng kohortunda Braak II ile Braak 0 grupları arasında yaş aralıkları örtüşmemektedir (Braak 0: 50–71, Braak II: 72–91; r = 0,80; VIF = 2,74). Braak II kontrastı korunup donör düzeyinde çıkarım ve yaş kovaryatı eklendiğinde, RRHO2 haritasındaki DD çeyreğinin en yüksek değeri 6,54’ten 1,48’e (düzeltilmiş P = 1) düşmüştür (Şekil 5D). Plana uygun Braak VI sıralaması ile orijinal sıralama arasındaki Spearman korelasyonu ise 0,584’tür. Sonuç olarak, orijinal analizdeki DD sinyali, psödo-replikasyon ile yaş kovaryatının atlanmasının birlikte yarattığı bir sinyal olarak değerlendirilmektedir.</w:t>
       </w:r>
     </w:p>
     <w:p>

</xml_diff>